<commit_message>
Complete order flow: add returns (reverse logistics) + cross-dock to plan; add returns flowchart
- layout.py order-flow: steps 7-9 returns (in -> grade -> restock/scrap) + cross-dock arc for 855 shipped-not-stocked SKUs
- flowcharts.py: new Returns/reverse-logistics flowchart
- build_report_d2: add 2.5 Returns section; renumber figures (returns Fig 5, layout 6/7/8, FTE 9)

Co-Authored-By: Claude Opus 4.8 <noreply@anthropic.com>
</commit_message>
<xml_diff>
--- a/deliverables/Deliverable_2_Future_State.docx
+++ b/deliverables/Deliverable_2_Future_State.docx
@@ -808,6 +808,143 @@
           <w:sz w:val="17"/>
         </w:rPr>
         <w:t>Fig 4. Consolidation, packing &amp; shipping flow.</w:t>
+      </w:r>
+    </w:p>
+    <w:p>
+      <w:pPr>
+        <w:pStyle w:val="Heading2"/>
+      </w:pPr>
+      <w:r>
+        <w:t>2.5 Returns (reverse logistics)</w:t>
+      </w:r>
+    </w:p>
+    <w:p>
+      <w:pPr>
+        <w:pStyle w:val="ListBullet"/>
+      </w:pPr>
+      <w:r>
+        <w:rPr>
+          <w:b w:val="0"/>
+          <w:sz w:val="21"/>
+        </w:rPr>
+      </w:r>
+      <w:r>
+        <w:rPr>
+          <w:b/>
+          <w:sz w:val="21"/>
+        </w:rPr>
+        <w:t>Steps:</w:t>
+      </w:r>
+      <w:r>
+        <w:rPr>
+          <w:b w:val="0"/>
+          <w:sz w:val="21"/>
+        </w:rPr>
+        <w:t xml:space="preserve"> customer return arrives → receive &amp; scan (RMA) at receiving docks → inspect &amp; grade at Returns/VAS → sellable? restock : reworkable? rework (VAS) &amp; restock : scrap / return-to-vendor → update inventory &amp; credit.</w:t>
+      </w:r>
+    </w:p>
+    <w:p>
+      <w:pPr>
+        <w:pStyle w:val="ListBullet"/>
+      </w:pPr>
+      <w:r>
+        <w:rPr>
+          <w:b w:val="0"/>
+          <w:sz w:val="21"/>
+        </w:rPr>
+      </w:r>
+      <w:r>
+        <w:rPr>
+          <w:b/>
+          <w:sz w:val="21"/>
+        </w:rPr>
+        <w:t>Policy applied:</w:t>
+      </w:r>
+      <w:r>
+        <w:rPr>
+          <w:b w:val="0"/>
+          <w:sz w:val="21"/>
+        </w:rPr>
+        <w:t xml:space="preserve"> returns re-enter via the same velocity-based putaway; graded stock rejoins reserve, scrap/RTV leaves the building. A small share of outbound orders also route through VAS before packing.</w:t>
+      </w:r>
+    </w:p>
+    <w:p>
+      <w:pPr>
+        <w:pStyle w:val="ListBullet"/>
+      </w:pPr>
+      <w:r>
+        <w:rPr>
+          <w:b w:val="0"/>
+          <w:sz w:val="21"/>
+        </w:rPr>
+      </w:r>
+      <w:r>
+        <w:rPr>
+          <w:b/>
+          <w:sz w:val="21"/>
+        </w:rPr>
+        <w:t>Order-flow map:</w:t>
+      </w:r>
+      <w:r>
+        <w:rPr>
+          <w:b w:val="0"/>
+          <w:sz w:val="21"/>
+        </w:rPr>
+        <w:t xml:space="preserve"> steps 7–9 (purple) in Fig 6 show returns in → grade → restock/scrap; the grey dashed line shows cross-dock for the 855 SKUs shipped but never stocked.</w:t>
+      </w:r>
+    </w:p>
+    <w:p>
+      <w:pPr>
+        <w:jc w:val="center"/>
+      </w:pPr>
+      <w:r>
+        <w:drawing>
+          <wp:inline xmlns:a="http://schemas.openxmlformats.org/drawingml/2006/main" xmlns:pic="http://schemas.openxmlformats.org/drawingml/2006/picture">
+            <wp:extent cx="4320000" cy="4750279"/>
+            <wp:docPr id="5" name="Picture 5"/>
+            <wp:cNvGraphicFramePr>
+              <a:graphicFrameLocks noChangeAspect="1"/>
+            </wp:cNvGraphicFramePr>
+            <a:graphic>
+              <a:graphicData uri="http://schemas.openxmlformats.org/drawingml/2006/picture">
+                <pic:pic>
+                  <pic:nvPicPr>
+                    <pic:cNvPr id="0" name="flow_returns.png"/>
+                    <pic:cNvPicPr/>
+                  </pic:nvPicPr>
+                  <pic:blipFill>
+                    <a:blip r:embed="rId13"/>
+                    <a:stretch>
+                      <a:fillRect/>
+                    </a:stretch>
+                  </pic:blipFill>
+                  <pic:spPr>
+                    <a:xfrm>
+                      <a:off x="0" y="0"/>
+                      <a:ext cx="4320000" cy="4750279"/>
+                    </a:xfrm>
+                    <a:prstGeom prst="rect"/>
+                  </pic:spPr>
+                </pic:pic>
+              </a:graphicData>
+            </a:graphic>
+          </wp:inline>
+        </w:drawing>
+      </w:r>
+    </w:p>
+    <w:p>
+      <w:pPr>
+        <w:spacing w:after="200"/>
+        <w:jc w:val="center"/>
+      </w:pPr>
+      <w:r>
+        <w:rPr>
+          <w:b w:val="0"/>
+          <w:i/>
+          <w:color w:val="666666"/>
+          <w:sz w:val="17"/>
+        </w:rPr>
+        <w:t>Fig 5. Returns / reverse-logistics flow.</w:t>
       </w:r>
     </w:p>
     <w:p>
@@ -1858,8 +1995,8 @@
       <w:r>
         <w:drawing>
           <wp:inline xmlns:a="http://schemas.openxmlformats.org/drawingml/2006/main" xmlns:pic="http://schemas.openxmlformats.org/drawingml/2006/picture">
-            <wp:extent cx="5760000" cy="4333458"/>
-            <wp:docPr id="5" name="Picture 5"/>
+            <wp:extent cx="5760000" cy="4408823"/>
+            <wp:docPr id="6" name="Picture 6"/>
             <wp:cNvGraphicFramePr>
               <a:graphicFrameLocks noChangeAspect="1"/>
             </wp:cNvGraphicFramePr>
@@ -1871,7 +2008,7 @@
                     <pic:cNvPicPr/>
                   </pic:nvPicPr>
                   <pic:blipFill>
-                    <a:blip r:embed="rId13"/>
+                    <a:blip r:embed="rId14"/>
                     <a:stretch>
                       <a:fillRect/>
                     </a:stretch>
@@ -1879,7 +2016,7 @@
                   <pic:spPr>
                     <a:xfrm>
                       <a:off x="0" y="0"/>
-                      <a:ext cx="5760000" cy="4333458"/>
+                      <a:ext cx="5760000" cy="4408823"/>
                     </a:xfrm>
                     <a:prstGeom prst="rect"/>
                   </pic:spPr>
@@ -1902,7 +2039,7 @@
           <w:color w:val="666666"/>
           <w:sz w:val="17"/>
         </w:rPr>
-        <w:t>Fig 5. Option B layout &amp; zoning, to scale, with order flow (①inbound→⑥ship).</w:t>
+        <w:t>Fig 6. Layout, zoning &amp; full order flow — forward (1–6), returns (7–9), cross-dock.</w:t>
       </w:r>
     </w:p>
     <w:p>
@@ -1913,7 +2050,7 @@
         <w:drawing>
           <wp:inline xmlns:a="http://schemas.openxmlformats.org/drawingml/2006/main" xmlns:pic="http://schemas.openxmlformats.org/drawingml/2006/picture">
             <wp:extent cx="5040000" cy="4123637"/>
-            <wp:docPr id="6" name="Picture 6"/>
+            <wp:docPr id="7" name="Picture 7"/>
             <wp:cNvGraphicFramePr>
               <a:graphicFrameLocks noChangeAspect="1"/>
             </wp:cNvGraphicFramePr>
@@ -1925,7 +2062,7 @@
                     <pic:cNvPicPr/>
                   </pic:nvPicPr>
                   <pic:blipFill>
-                    <a:blip r:embed="rId14"/>
+                    <a:blip r:embed="rId15"/>
                     <a:stretch>
                       <a:fillRect/>
                     </a:stretch>
@@ -1956,7 +2093,7 @@
           <w:color w:val="666666"/>
           <w:sz w:val="17"/>
         </w:rPr>
-        <w:t>Fig 6. Option B 3D massing (isometric) — reserve racking ≈ 11.5 m within the 12.2 m limit.</w:t>
+        <w:t>Fig 7. Option B 3D massing (isometric) — reserve racking ≈ 11.5 m within the 12.2 m limit.</w:t>
       </w:r>
     </w:p>
     <w:p>
@@ -1967,7 +2104,7 @@
         <w:drawing>
           <wp:inline xmlns:a="http://schemas.openxmlformats.org/drawingml/2006/main" xmlns:pic="http://schemas.openxmlformats.org/drawingml/2006/picture">
             <wp:extent cx="5760000" cy="4936332"/>
-            <wp:docPr id="7" name="Picture 7"/>
+            <wp:docPr id="8" name="Picture 8"/>
             <wp:cNvGraphicFramePr>
               <a:graphicFrameLocks noChangeAspect="1"/>
             </wp:cNvGraphicFramePr>
@@ -1979,7 +2116,7 @@
                     <pic:cNvPicPr/>
                   </pic:nvPicPr>
                   <pic:blipFill>
-                    <a:blip r:embed="rId15"/>
+                    <a:blip r:embed="rId16"/>
                     <a:stretch>
                       <a:fillRect/>
                     </a:stretch>
@@ -2010,7 +2147,7 @@
           <w:color w:val="666666"/>
           <w:sz w:val="17"/>
         </w:rPr>
-        <w:t>Fig 7. Worker movement — zone picking keeps picker paths short and separated.</w:t>
+        <w:t>Fig 8. Worker movement — zone picking keeps picker paths short and separated.</w:t>
       </w:r>
     </w:p>
     <w:p>
@@ -2674,7 +2811,7 @@
         <w:drawing>
           <wp:inline xmlns:a="http://schemas.openxmlformats.org/drawingml/2006/main" xmlns:pic="http://schemas.openxmlformats.org/drawingml/2006/picture">
             <wp:extent cx="5040000" cy="2479726"/>
-            <wp:docPr id="8" name="Picture 8"/>
+            <wp:docPr id="9" name="Picture 9"/>
             <wp:cNvGraphicFramePr>
               <a:graphicFrameLocks noChangeAspect="1"/>
             </wp:cNvGraphicFramePr>
@@ -2686,7 +2823,7 @@
                     <pic:cNvPicPr/>
                   </pic:nvPicPr>
                   <pic:blipFill>
-                    <a:blip r:embed="rId16"/>
+                    <a:blip r:embed="rId17"/>
                     <a:stretch>
                       <a:fillRect/>
                     </a:stretch>
@@ -2717,7 +2854,7 @@
           <w:color w:val="666666"/>
           <w:sz w:val="17"/>
         </w:rPr>
-        <w:t>Fig 8. Labour requirement by process (average vs peak).</w:t>
+        <w:t>Fig 9. Labour requirement by process (average vs peak).</w:t>
       </w:r>
     </w:p>
     <w:p>
@@ -3474,7 +3611,7 @@
       </w:pPr>
     </w:p>
     <w:sectPr>
-      <w:footerReference w:type="default" r:id="rId17"/>
+      <w:footerReference w:type="default" r:id="rId18"/>
       <w:pgSz w:w="12240" w:h="15840"/>
       <w:pgMar w:top="1440" w:right="1800" w:bottom="1440" w:left="1800" w:header="720" w:footer="720" w:gutter="0"/>
       <w:cols w:space="720"/>

</xml_diff>

<commit_message>
Fit within 7,000 m2: size working areas from order volume; layout now 6,541 m2 (93%), packed footprint
- layout.py: functional areas from measured peak throughput (inbound ~90 / outbound ~50 pallets/day); column widths derived from content so building outline == real footprint (no whitespace)
- design FITS: 6,541 m2 = 93% of 7,000, ~14,074 positions, ~7% buffer
- build_report_d2 + assumptions A013 updated to volume-based sizing

Co-Authored-By: Claude Opus 4.8 <noreply@anthropic.com>
</commit_message>
<xml_diff>
--- a/deliverables/Deliverable_2_Future_State.docx
+++ b/deliverables/Deliverable_2_Future_State.docx
@@ -1391,7 +1391,7 @@
           <w:color w:val="222222"/>
           <w:sz w:val="21"/>
         </w:rPr>
-        <w:t>The zones are sized from the capacity analysis and laid out flow-through (receiving one side, shipping the other). Building ≈ 108 m × 70 m, providing ~14,074 pallet positions against the ~14,074 target.</w:t>
+        <w:t>The zones are sized from the capacity analysis and laid out flow-through (receiving one side, shipping the other). Building ≈ 93 m × 70 m, providing ~14,074 pallet positions against the ~14,074 target.</w:t>
       </w:r>
     </w:p>
     <w:tbl>
@@ -1481,7 +1481,7 @@
               <w:rPr>
                 <w:sz w:val="19"/>
               </w:rPr>
-              <w:t>700</w:t>
+              <w:t>262</w:t>
             </w:r>
           </w:p>
         </w:tc>
@@ -1498,7 +1498,7 @@
               <w:rPr>
                 <w:sz w:val="19"/>
               </w:rPr>
-              <w:t>9%</w:t>
+              <w:t>4%</w:t>
             </w:r>
           </w:p>
         </w:tc>
@@ -1531,7 +1531,7 @@
               <w:rPr>
                 <w:sz w:val="19"/>
               </w:rPr>
-              <w:t>300</w:t>
+              <w:t>250</w:t>
             </w:r>
           </w:p>
         </w:tc>
@@ -1581,7 +1581,7 @@
               <w:rPr>
                 <w:sz w:val="19"/>
               </w:rPr>
-              <w:t>300</w:t>
+              <w:t>180</w:t>
             </w:r>
           </w:p>
         </w:tc>
@@ -1598,7 +1598,7 @@
               <w:rPr>
                 <w:sz w:val="19"/>
               </w:rPr>
-              <w:t>4%</w:t>
+              <w:t>3%</w:t>
             </w:r>
           </w:p>
         </w:tc>
@@ -1648,7 +1648,7 @@
               <w:rPr>
                 <w:sz w:val="19"/>
               </w:rPr>
-              <w:t>47%</w:t>
+              <w:t>54%</w:t>
             </w:r>
           </w:p>
         </w:tc>
@@ -1698,7 +1698,7 @@
               <w:rPr>
                 <w:sz w:val="19"/>
               </w:rPr>
-              <w:t>10%</w:t>
+              <w:t>11%</w:t>
             </w:r>
           </w:p>
         </w:tc>
@@ -1731,7 +1731,7 @@
               <w:rPr>
                 <w:sz w:val="19"/>
               </w:rPr>
-              <w:t>400</w:t>
+              <w:t>500</w:t>
             </w:r>
           </w:p>
         </w:tc>
@@ -1748,7 +1748,7 @@
               <w:rPr>
                 <w:sz w:val="19"/>
               </w:rPr>
-              <w:t>5%</w:t>
+              <w:t>8%</w:t>
             </w:r>
           </w:p>
         </w:tc>
@@ -1781,7 +1781,7 @@
               <w:rPr>
                 <w:sz w:val="19"/>
               </w:rPr>
-              <w:t>700</w:t>
+              <w:t>450</w:t>
             </w:r>
           </w:p>
         </w:tc>
@@ -1798,7 +1798,7 @@
               <w:rPr>
                 <w:sz w:val="19"/>
               </w:rPr>
-              <w:t>9%</w:t>
+              <w:t>7%</w:t>
             </w:r>
           </w:p>
         </w:tc>
@@ -1831,7 +1831,7 @@
               <w:rPr>
                 <w:sz w:val="19"/>
               </w:rPr>
-              <w:t>300</w:t>
+              <w:t>216</w:t>
             </w:r>
           </w:p>
         </w:tc>
@@ -1848,7 +1848,7 @@
               <w:rPr>
                 <w:sz w:val="19"/>
               </w:rPr>
-              <w:t>4%</w:t>
+              <w:t>3%</w:t>
             </w:r>
           </w:p>
         </w:tc>
@@ -1881,7 +1881,7 @@
               <w:rPr>
                 <w:sz w:val="19"/>
               </w:rPr>
-              <w:t>560</w:t>
+              <w:t>450</w:t>
             </w:r>
           </w:p>
         </w:tc>
@@ -1920,33 +1920,7 @@
           <w:color w:val="222222"/>
           <w:sz w:val="21"/>
         </w:rPr>
-        <w:t>**Total floor area 7,493 m² = 107% of a 7,000 m² envelope.**</w:t>
-      </w:r>
-    </w:p>
-    <w:p>
-      <w:pPr>
-        <w:pStyle w:val="ListBullet"/>
-      </w:pPr>
-      <w:r>
-        <w:rPr>
-          <w:b w:val="0"/>
-          <w:sz w:val="21"/>
-        </w:rPr>
-        <w:t xml:space="preserve">At the detailed zoning level Option B lands </w:t>
-      </w:r>
-      <w:r>
-        <w:rPr>
-          <w:b/>
-          <w:sz w:val="21"/>
-        </w:rPr>
-        <w:t>slightly over 7,000 m² (107%)</w:t>
-      </w:r>
-      <w:r>
-        <w:rPr>
-          <w:b w:val="0"/>
-          <w:sz w:val="21"/>
-        </w:rPr>
-        <w:t xml:space="preserve"> once full functional areas are included — tighter than the concept-level estimate.</w:t>
+        <w:t>**Total floor area 6,541 m² = 93% of a 7,000 m² envelope.**</w:t>
       </w:r>
     </w:p>
     <w:p>
@@ -1964,28 +1938,64 @@
           <w:b/>
           <w:sz w:val="21"/>
         </w:rPr>
-        <w:t>Mitigations if 7,000 m² is the binding Assa-only envelope (A008):</w:t>
+        <w:t>Working areas are sized from the actual order volume</w:t>
       </w:r>
       <w:r>
         <w:rPr>
           <w:b w:val="0"/>
           <w:sz w:val="21"/>
         </w:rPr>
-        <w:t xml:space="preserve"> (a) raise the double-deep share or add an 8th rack level (12.2 m height allows it, subject to truck reach); (b) trim office/returns/staging; (c) switch reserve to </w:t>
+        <w:t>, not a flat allowance: peak inbound ≈ 90 and outbound ≈ 50 palletised loads/day (the operation is parcel-heavy), so receiving/outbound staging are compact — receiving 262 m², outbound 216 m², packing 450 m² (parcel put-wall).</w:t>
+      </w:r>
+    </w:p>
+    <w:p>
+      <w:pPr>
+        <w:pStyle w:val="ListBullet"/>
+      </w:pPr>
+      <w:r>
+        <w:rPr>
+          <w:b w:val="0"/>
+          <w:sz w:val="21"/>
+        </w:rPr>
       </w:r>
       <w:r>
         <w:rPr>
           <w:b/>
           <w:sz w:val="21"/>
         </w:rPr>
-        <w:t>VNA (Option C)</w:t>
+        <w:t>The design fits within the envelope: 6,541 m² = 93% of 7,000 m²</w:t>
       </w:r>
       <w:r>
         <w:rPr>
           <w:b w:val="0"/>
           <w:sz w:val="21"/>
         </w:rPr>
-        <w:t>, which frees ~2,000 m² and gives real headroom.</w:t>
+        <w:t>, holding ~14,074 pallet positions (peak 11,015 + 15% growth, at 90% utilisation) with ~7% floor buffer.</w:t>
+      </w:r>
+    </w:p>
+    <w:p>
+      <w:pPr>
+        <w:pStyle w:val="ListBullet"/>
+      </w:pPr>
+      <w:r>
+        <w:rPr>
+          <w:b w:val="0"/>
+          <w:sz w:val="21"/>
+        </w:rPr>
+      </w:r>
+      <w:r>
+        <w:rPr>
+          <w:b/>
+          <w:sz w:val="21"/>
+        </w:rPr>
+        <w:t>Headroom if demand outgrows this:</w:t>
+      </w:r>
+      <w:r>
+        <w:rPr>
+          <w:b w:val="0"/>
+          <w:sz w:val="21"/>
+        </w:rPr>
+        <w:t xml:space="preserve"> add an 8th rack level (12.2 m allows it, subject to truck reach), raise the double-deep share, or move reserve to VNA (Option C). Confirm the 7,000 m² scope (A008).</w:t>
       </w:r>
     </w:p>
     <w:p>
@@ -1995,7 +2005,7 @@
       <w:r>
         <w:drawing>
           <wp:inline xmlns:a="http://schemas.openxmlformats.org/drawingml/2006/main" xmlns:pic="http://schemas.openxmlformats.org/drawingml/2006/picture">
-            <wp:extent cx="5760000" cy="4408823"/>
+            <wp:extent cx="5760000" cy="4518621"/>
             <wp:docPr id="6" name="Picture 6"/>
             <wp:cNvGraphicFramePr>
               <a:graphicFrameLocks noChangeAspect="1"/>
@@ -2016,7 +2026,7 @@
                   <pic:spPr>
                     <a:xfrm>
                       <a:off x="0" y="0"/>
-                      <a:ext cx="5760000" cy="4408823"/>
+                      <a:ext cx="5760000" cy="4518621"/>
                     </a:xfrm>
                     <a:prstGeom prst="rect"/>
                   </pic:spPr>
@@ -3568,6 +3578,53 @@
               <w:rPr>
                 <w:sz w:val="19"/>
               </w:rPr>
+              <w:t>A013</w:t>
+            </w:r>
+          </w:p>
+        </w:tc>
+        <w:tc>
+          <w:tcPr>
+            <w:tcW w:type="dxa" w:w="6520"/>
+          </w:tcPr>
+          <w:p>
+            <w:r/>
+            <w:r>
+              <w:rPr>
+                <w:sz w:val="19"/>
+              </w:rPr>
+              <w:t>Functional (non-storage) areas sized from actual order volume</w:t>
+            </w:r>
+          </w:p>
+        </w:tc>
+        <w:tc>
+          <w:tcPr>
+            <w:tcW w:type="dxa" w:w="1134"/>
+          </w:tcPr>
+          <w:p>
+            <w:pPr>
+              <w:jc w:val="right"/>
+            </w:pPr>
+            <w:r/>
+            <w:r>
+              <w:rPr>
+                <w:sz w:val="19"/>
+              </w:rPr>
+              <w:t>HIGH</w:t>
+            </w:r>
+          </w:p>
+        </w:tc>
+      </w:tr>
+      <w:tr>
+        <w:tc>
+          <w:tcPr>
+            <w:tcW w:type="dxa" w:w="850"/>
+          </w:tcPr>
+          <w:p>
+            <w:r/>
+            <w:r>
+              <w:rPr>
+                <w:sz w:val="19"/>
+              </w:rPr>
               <w:t>A014</w:t>
             </w:r>
           </w:p>

</xml_diff>